<commit_message>
feat: añadir pestaña auditoria
</commit_message>
<xml_diff>
--- a/backend/templates/CERTIFICADO_PLANTILLA.docx
+++ b/backend/templates/CERTIFICADO_PLANTILLA.docx
@@ -1,6 +1,6 @@
 
 <file path=word/document.xml><?xml version="1.0" encoding="utf-8"?>
-<w:document xmlns:wpc="http://schemas.microsoft.com/office/word/2010/wordprocessingCanvas" xmlns:cx="http://schemas.microsoft.com/office/drawing/2014/chartex" xmlns:cx1="http://schemas.microsoft.com/office/drawing/2015/9/8/chartex" xmlns:cx2="http://schemas.microsoft.com/office/drawing/2015/10/21/chartex" xmlns:cx3="http://schemas.microsoft.com/office/drawing/2016/5/9/chartex" xmlns:cx4="http://schemas.microsoft.com/office/drawing/2016/5/10/chartex" xmlns:cx5="http://schemas.microsoft.com/office/drawing/2016/5/11/chartex" xmlns:cx6="http://schemas.microsoft.com/office/drawing/2016/5/12/chartex" xmlns:cx7="http://schemas.microsoft.com/office/drawing/2016/5/13/chartex" xmlns:cx8="http://schemas.microsoft.com/office/drawing/2016/5/14/chartex" xmlns:mc="http://schemas.openxmlformats.org/markup-compatibility/2006" xmlns:aink="http://schemas.microsoft.com/office/drawing/2016/ink" xmlns:am3d="http://schemas.microsoft.com/office/drawing/2017/model3d" xmlns:o="urn:schemas-microsoft-com:office:office" xmlns:r="http://schemas.openxmlformats.org/officeDocument/2006/relationships" xmlns:m="http://schemas.openxmlformats.org/officeDocument/2006/math" xmlns:v="urn:schemas-microsoft-com:vml" xmlns:wp14="http://schemas.microsoft.com/office/word/2010/wordprocessingDrawing" xmlns:wp="http://schemas.openxmlformats.org/drawingml/2006/wordprocessingDrawing" xmlns:w10="urn:schemas-microsoft-com:office:word" xmlns:w="http://schemas.openxmlformats.org/wordprocessingml/2006/main" xmlns:w14="http://schemas.microsoft.com/office/word/2010/wordml" xmlns:w15="http://schemas.microsoft.com/office/word/2012/wordml" xmlns:w16cex="http://schemas.microsoft.com/office/word/2018/wordml/cex" xmlns:w16cid="http://schemas.microsoft.com/office/word/2016/wordml/cid" xmlns:w16="http://schemas.microsoft.com/office/word/2018/wordml" xmlns:w16sdtdh="http://schemas.microsoft.com/office/word/2020/wordml/sdtdatahash" xmlns:w16se="http://schemas.microsoft.com/office/word/2015/wordml/symex" xmlns:wpg="http://schemas.microsoft.com/office/word/2010/wordprocessingGroup" xmlns:wpi="http://schemas.microsoft.com/office/word/2010/wordprocessingInk" xmlns:wne="http://schemas.microsoft.com/office/word/2006/wordml" xmlns:wps="http://schemas.microsoft.com/office/word/2010/wordprocessingShape" mc:Ignorable="w14 w15 w16se w16cid w16 w16cex w16sdtdh wp14">
+<w:document xmlns:wpc="http://schemas.microsoft.com/office/word/2010/wordprocessingCanvas" xmlns:cx="http://schemas.microsoft.com/office/drawing/2014/chartex" xmlns:cx1="http://schemas.microsoft.com/office/drawing/2015/9/8/chartex" xmlns:cx2="http://schemas.microsoft.com/office/drawing/2015/10/21/chartex" xmlns:cx3="http://schemas.microsoft.com/office/drawing/2016/5/9/chartex" xmlns:cx4="http://schemas.microsoft.com/office/drawing/2016/5/10/chartex" xmlns:cx5="http://schemas.microsoft.com/office/drawing/2016/5/11/chartex" xmlns:cx6="http://schemas.microsoft.com/office/drawing/2016/5/12/chartex" xmlns:cx7="http://schemas.microsoft.com/office/drawing/2016/5/13/chartex" xmlns:cx8="http://schemas.microsoft.com/office/drawing/2016/5/14/chartex" xmlns:mc="http://schemas.openxmlformats.org/markup-compatibility/2006" xmlns:aink="http://schemas.microsoft.com/office/drawing/2016/ink" xmlns:am3d="http://schemas.microsoft.com/office/drawing/2017/model3d" xmlns:o="urn:schemas-microsoft-com:office:office" xmlns:oel="http://schemas.microsoft.com/office/2019/extlst" xmlns:r="http://schemas.openxmlformats.org/officeDocument/2006/relationships" xmlns:m="http://schemas.openxmlformats.org/officeDocument/2006/math" xmlns:v="urn:schemas-microsoft-com:vml" xmlns:wp14="http://schemas.microsoft.com/office/word/2010/wordprocessingDrawing" xmlns:wp="http://schemas.openxmlformats.org/drawingml/2006/wordprocessingDrawing" xmlns:w10="urn:schemas-microsoft-com:office:word" xmlns:w="http://schemas.openxmlformats.org/wordprocessingml/2006/main" xmlns:w14="http://schemas.microsoft.com/office/word/2010/wordml" xmlns:w15="http://schemas.microsoft.com/office/word/2012/wordml" xmlns:w16cex="http://schemas.microsoft.com/office/word/2018/wordml/cex" xmlns:w16cid="http://schemas.microsoft.com/office/word/2016/wordml/cid" xmlns:w16="http://schemas.microsoft.com/office/word/2018/wordml" xmlns:w16du="http://schemas.microsoft.com/office/word/2023/wordml/word16du" xmlns:w16sdtdh="http://schemas.microsoft.com/office/word/2020/wordml/sdtdatahash" xmlns:w16sdtfl="http://schemas.microsoft.com/office/word/2024/wordml/sdtformatlock" xmlns:w16se="http://schemas.microsoft.com/office/word/2015/wordml/symex" xmlns:wpg="http://schemas.microsoft.com/office/word/2010/wordprocessingGroup" xmlns:wpi="http://schemas.microsoft.com/office/word/2010/wordprocessingInk" xmlns:wne="http://schemas.microsoft.com/office/word/2006/wordml" xmlns:wps="http://schemas.microsoft.com/office/word/2010/wordprocessingShape" mc:Ignorable="w14 w15 w16se w16cid w16 w16cex w16sdtdh w16sdtfl w16du wp14">
   <w:body>
     <w:p>
       <w:pPr>
@@ -380,7 +380,7 @@
                 <v:stroke joinstyle="miter"/>
                 <v:path gradientshapeok="t" o:connecttype="rect"/>
               </v:shapetype>
-              <v:shape id="Cuadro de texto 1" o:spid="_x0000_s1026" type="#_x0000_t202" style="position:absolute;left:0;text-align:left;margin-left:188.25pt;margin-top:-.5pt;width:310.4pt;height:39.95pt;z-index:251662336;visibility:visible;mso-wrap-style:square;mso-width-percent:0;mso-height-percent:0;mso-wrap-distance-left:9pt;mso-wrap-distance-top:0;mso-wrap-distance-right:9pt;mso-wrap-distance-bottom:0;mso-position-horizontal:absolute;mso-position-horizontal-relative:margin;mso-position-vertical:absolute;mso-position-vertical-relative:margin;mso-width-percent:0;mso-height-percent:0;mso-width-relative:margin;mso-height-relative:margin;v-text-anchor:top" o:gfxdata="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" filled="f" stroked="f" strokeweight=".5pt">
+              <v:shape id="Cuadro de texto 1" o:spid="_x0000_s1026" type="#_x0000_t202" style="position:absolute;left:0;text-align:left;margin-left:188.25pt;margin-top:-.5pt;width:310.4pt;height:39.95pt;z-index:251662336;visibility:visible;mso-wrap-style:square;mso-width-percent:0;mso-height-percent:0;mso-wrap-distance-left:9pt;mso-wrap-distance-top:0;mso-wrap-distance-right:9pt;mso-wrap-distance-bottom:0;mso-position-horizontal:absolute;mso-position-horizontal-relative:margin;mso-position-vertical:absolute;mso-position-vertical-relative:margin;mso-width-percent:0;mso-height-percent:0;mso-width-relative:margin;mso-height-relative:margin;v-text-anchor:top" o:gfxdata="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" filled="f" stroked="f" strokeweight=".5pt">
                 <v:shadow on="t" color="black" opacity="26214f" origin="-.5,-.5" offset=".74836mm,.74836mm"/>
                 <v:textbox>
                   <w:txbxContent>
@@ -802,7 +802,7 @@
           </mc:Choice>
           <mc:Fallback>
             <w:pict>
-              <v:shape w14:anchorId="563B4A20" id="_x0000_s1027" type="#_x0000_t202" style="position:absolute;left:0;text-align:left;margin-left:193.1pt;margin-top:41.8pt;width:296.3pt;height:26.75pt;z-index:251664384;visibility:visible;mso-wrap-style:square;mso-width-percent:0;mso-height-percent:0;mso-wrap-distance-left:9pt;mso-wrap-distance-top:0;mso-wrap-distance-right:9pt;mso-wrap-distance-bottom:0;mso-position-horizontal:absolute;mso-position-horizontal-relative:margin;mso-position-vertical:absolute;mso-position-vertical-relative:margin;mso-width-percent:0;mso-height-percent:0;mso-width-relative:margin;mso-height-relative:margin;v-text-anchor:top" o:gfxdata="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" filled="f" stroked="f" strokeweight=".5pt">
+              <v:shape w14:anchorId="563B4A20" id="_x0000_s1027" type="#_x0000_t202" style="position:absolute;left:0;text-align:left;margin-left:193.1pt;margin-top:41.8pt;width:296.3pt;height:26.75pt;z-index:251664384;visibility:visible;mso-wrap-style:square;mso-width-percent:0;mso-height-percent:0;mso-wrap-distance-left:9pt;mso-wrap-distance-top:0;mso-wrap-distance-right:9pt;mso-wrap-distance-bottom:0;mso-position-horizontal:absolute;mso-position-horizontal-relative:margin;mso-position-vertical:absolute;mso-position-vertical-relative:margin;mso-width-percent:0;mso-height-percent:0;mso-width-relative:margin;mso-height-relative:margin;v-text-anchor:top" o:gfxdata="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" filled="f" stroked="f" strokeweight=".5pt">
                 <v:textbox>
                   <w:txbxContent>
                     <w:p>
@@ -937,7 +937,27 @@
                                 <w:color w:val="000000" w:themeColor="text1"/>
                                 <w:lang w:val="es-MX"/>
                               </w:rPr>
-                              <w:t>CEL: 943330287  FIJO: 354 2718</w:t>
+                              <w:t xml:space="preserve">CEL: </w:t>
+                            </w:r>
+                            <w:proofErr w:type="gramStart"/>
+                            <w:r>
+                              <w:rPr>
+                                <w:b/>
+                                <w:bCs/>
+                                <w:color w:val="000000" w:themeColor="text1"/>
+                                <w:lang w:val="es-MX"/>
+                              </w:rPr>
+                              <w:t>943330287  FIJO</w:t>
+                            </w:r>
+                            <w:proofErr w:type="gramEnd"/>
+                            <w:r>
+                              <w:rPr>
+                                <w:b/>
+                                <w:bCs/>
+                                <w:color w:val="000000" w:themeColor="text1"/>
+                                <w:lang w:val="es-MX"/>
+                              </w:rPr>
+                              <w:t>: 354 2718</w:t>
                             </w:r>
                           </w:p>
                           <w:p>
@@ -958,7 +978,47 @@
                                 <w:color w:val="000000" w:themeColor="text1"/>
                                 <w:lang w:val="es-MX"/>
                               </w:rPr>
-                              <w:t>Jr. Los Cocos Mz. H Lt. 7 - Urb. La Portada de Ceres</w:t>
+                              <w:t xml:space="preserve">Jr. Los Cocos </w:t>
+                            </w:r>
+                            <w:proofErr w:type="spellStart"/>
+                            <w:r>
+                              <w:rPr>
+                                <w:b/>
+                                <w:bCs/>
+                                <w:color w:val="000000" w:themeColor="text1"/>
+                                <w:lang w:val="es-MX"/>
+                              </w:rPr>
+                              <w:t>Mz</w:t>
+                            </w:r>
+                            <w:proofErr w:type="spellEnd"/>
+                            <w:r>
+                              <w:rPr>
+                                <w:b/>
+                                <w:bCs/>
+                                <w:color w:val="000000" w:themeColor="text1"/>
+                                <w:lang w:val="es-MX"/>
+                              </w:rPr>
+                              <w:t xml:space="preserve">. H </w:t>
+                            </w:r>
+                            <w:proofErr w:type="spellStart"/>
+                            <w:r>
+                              <w:rPr>
+                                <w:b/>
+                                <w:bCs/>
+                                <w:color w:val="000000" w:themeColor="text1"/>
+                                <w:lang w:val="es-MX"/>
+                              </w:rPr>
+                              <w:t>Lt</w:t>
+                            </w:r>
+                            <w:proofErr w:type="spellEnd"/>
+                            <w:r>
+                              <w:rPr>
+                                <w:b/>
+                                <w:bCs/>
+                                <w:color w:val="000000" w:themeColor="text1"/>
+                                <w:lang w:val="es-MX"/>
+                              </w:rPr>
+                              <w:t>. 7 - Urb. La Portada de Ceres</w:t>
                             </w:r>
                           </w:p>
                           <w:p>
@@ -1047,7 +1107,7 @@
           </mc:Choice>
           <mc:Fallback>
             <w:pict>
-              <v:shape w14:anchorId="3F966D81" id="Cuadro de texto 29" o:spid="_x0000_s1028" type="#_x0000_t202" style="position:absolute;left:0;text-align:left;margin-left:172.6pt;margin-top:67.35pt;width:337.4pt;height:73.7pt;z-index:251663360;visibility:visible;mso-wrap-style:square;mso-width-percent:0;mso-height-percent:0;mso-wrap-distance-left:9pt;mso-wrap-distance-top:0;mso-wrap-distance-right:9pt;mso-wrap-distance-bottom:0;mso-position-horizontal:absolute;mso-position-horizontal-relative:margin;mso-position-vertical:absolute;mso-position-vertical-relative:margin;mso-width-percent:0;mso-height-percent:0;mso-width-relative:margin;mso-height-relative:margin;v-text-anchor:top" o:gfxdata="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" filled="f" stroked="f" strokeweight=".5pt">
+              <v:shape w14:anchorId="3F966D81" id="Cuadro de texto 29" o:spid="_x0000_s1028" type="#_x0000_t202" style="position:absolute;left:0;text-align:left;margin-left:172.6pt;margin-top:67.35pt;width:337.4pt;height:73.7pt;z-index:251663360;visibility:visible;mso-wrap-style:square;mso-width-percent:0;mso-height-percent:0;mso-wrap-distance-left:9pt;mso-wrap-distance-top:0;mso-wrap-distance-right:9pt;mso-wrap-distance-bottom:0;mso-position-horizontal:absolute;mso-position-horizontal-relative:margin;mso-position-vertical:absolute;mso-position-vertical-relative:margin;mso-width-percent:0;mso-height-percent:0;mso-width-relative:margin;mso-height-relative:margin;v-text-anchor:top" o:gfxdata="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" filled="f" stroked="f" strokeweight=".5pt">
                 <v:textbox>
                   <w:txbxContent>
                     <w:p>
@@ -1089,7 +1149,27 @@
                           <w:color w:val="000000" w:themeColor="text1"/>
                           <w:lang w:val="es-MX"/>
                         </w:rPr>
-                        <w:t>CEL: 943330287  FIJO: 354 2718</w:t>
+                        <w:t xml:space="preserve">CEL: </w:t>
+                      </w:r>
+                      <w:proofErr w:type="gramStart"/>
+                      <w:r>
+                        <w:rPr>
+                          <w:b/>
+                          <w:bCs/>
+                          <w:color w:val="000000" w:themeColor="text1"/>
+                          <w:lang w:val="es-MX"/>
+                        </w:rPr>
+                        <w:t>943330287  FIJO</w:t>
+                      </w:r>
+                      <w:proofErr w:type="gramEnd"/>
+                      <w:r>
+                        <w:rPr>
+                          <w:b/>
+                          <w:bCs/>
+                          <w:color w:val="000000" w:themeColor="text1"/>
+                          <w:lang w:val="es-MX"/>
+                        </w:rPr>
+                        <w:t>: 354 2718</w:t>
                       </w:r>
                     </w:p>
                     <w:p>
@@ -1110,7 +1190,47 @@
                           <w:color w:val="000000" w:themeColor="text1"/>
                           <w:lang w:val="es-MX"/>
                         </w:rPr>
-                        <w:t>Jr. Los Cocos Mz. H Lt. 7 - Urb. La Portada de Ceres</w:t>
+                        <w:t xml:space="preserve">Jr. Los Cocos </w:t>
+                      </w:r>
+                      <w:proofErr w:type="spellStart"/>
+                      <w:r>
+                        <w:rPr>
+                          <w:b/>
+                          <w:bCs/>
+                          <w:color w:val="000000" w:themeColor="text1"/>
+                          <w:lang w:val="es-MX"/>
+                        </w:rPr>
+                        <w:t>Mz</w:t>
+                      </w:r>
+                      <w:proofErr w:type="spellEnd"/>
+                      <w:r>
+                        <w:rPr>
+                          <w:b/>
+                          <w:bCs/>
+                          <w:color w:val="000000" w:themeColor="text1"/>
+                          <w:lang w:val="es-MX"/>
+                        </w:rPr>
+                        <w:t xml:space="preserve">. H </w:t>
+                      </w:r>
+                      <w:proofErr w:type="spellStart"/>
+                      <w:r>
+                        <w:rPr>
+                          <w:b/>
+                          <w:bCs/>
+                          <w:color w:val="000000" w:themeColor="text1"/>
+                          <w:lang w:val="es-MX"/>
+                        </w:rPr>
+                        <w:t>Lt</w:t>
+                      </w:r>
+                      <w:proofErr w:type="spellEnd"/>
+                      <w:r>
+                        <w:rPr>
+                          <w:b/>
+                          <w:bCs/>
+                          <w:color w:val="000000" w:themeColor="text1"/>
+                          <w:lang w:val="es-MX"/>
+                        </w:rPr>
+                        <w:t>. 7 - Urb. La Portada de Ceres</w:t>
                       </w:r>
                     </w:p>
                     <w:p>
@@ -1339,7 +1459,7 @@
           </mc:Choice>
           <mc:Fallback>
             <w:pict>
-              <v:shape w14:anchorId="0D2F7FD2" id="_x0000_s1029" type="#_x0000_t202" style="position:absolute;left:0;text-align:left;margin-left:211.6pt;margin-top:11.8pt;width:270.45pt;height:50.5pt;z-index:251671552;visibility:visible;mso-wrap-style:none;mso-width-percent:0;mso-wrap-distance-left:9pt;mso-wrap-distance-top:0;mso-wrap-distance-right:9pt;mso-wrap-distance-bottom:0;mso-position-horizontal:absolute;mso-position-horizontal-relative:text;mso-position-vertical:absolute;mso-position-vertical-relative:text;mso-width-percent:0;mso-width-relative:margin;v-text-anchor:top" o:gfxdata="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" filled="f" stroked="f">
+              <v:shape w14:anchorId="0D2F7FD2" id="_x0000_s1029" type="#_x0000_t202" style="position:absolute;left:0;text-align:left;margin-left:211.6pt;margin-top:11.8pt;width:270.45pt;height:50.5pt;z-index:251671552;visibility:visible;mso-wrap-style:none;mso-width-percent:0;mso-wrap-distance-left:9pt;mso-wrap-distance-top:0;mso-wrap-distance-right:9pt;mso-wrap-distance-bottom:0;mso-position-horizontal:absolute;mso-position-horizontal-relative:text;mso-position-vertical:absolute;mso-position-vertical-relative:text;mso-width-percent:0;mso-width-relative:margin;v-text-anchor:top" o:gfxdata="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" filled="f" stroked="f">
                 <v:textbox style="mso-fit-shape-to-text:t">
                   <w:txbxContent>
                     <w:p>
@@ -1485,6 +1605,7 @@
                                 </w14:textOutline>
                               </w:rPr>
                             </w:pPr>
+                            <w:proofErr w:type="spellStart"/>
                             <w:r>
                               <w:rPr>
                                 <w:bCs/>
@@ -1504,7 +1625,29 @@
                                   <w14:round/>
                                 </w14:textOutline>
                               </w:rPr>
-                              <w:t>N° *N*</w:t>
+                              <w:t>N°</w:t>
+                            </w:r>
+                            <w:proofErr w:type="spellEnd"/>
+                            <w:r>
+                              <w:rPr>
+                                <w:bCs/>
+                                <w:color w:val="C00000"/>
+                                <w:sz w:val="44"/>
+                                <w:szCs w:val="44"/>
+                                <w14:shadow w14:blurRad="38100" w14:dist="19050" w14:dir="2700000" w14:sx="100000" w14:sy="100000" w14:kx="0" w14:ky="0" w14:algn="tl">
+                                  <w14:schemeClr w14:val="dk1">
+                                    <w14:alpha w14:val="60000"/>
+                                  </w14:schemeClr>
+                                </w14:shadow>
+                                <w14:textOutline w14:w="3175" w14:cap="flat" w14:cmpd="sng" w14:algn="ctr">
+                                  <w14:solidFill>
+                                    <w14:srgbClr w14:val="C00000"/>
+                                  </w14:solidFill>
+                                  <w14:prstDash w14:val="solid"/>
+                                  <w14:round/>
+                                </w14:textOutline>
+                              </w:rPr>
+                              <w:t xml:space="preserve"> *N*</w:t>
                             </w:r>
                           </w:p>
                           <w:p>
@@ -1549,7 +1692,7 @@
           </mc:Choice>
           <mc:Fallback>
             <w:pict>
-              <v:roundrect w14:anchorId="3796A4FE" id="Rectángulo: esquinas redondeadas 11" o:spid="_x0000_s1030" style="position:absolute;left:0;text-align:left;margin-left:6.25pt;margin-top:6.75pt;width:120.25pt;height:35.7pt;z-index:251670528;visibility:visible;mso-wrap-style:square;mso-width-percent:0;mso-height-percent:0;mso-wrap-distance-left:9pt;mso-wrap-distance-top:0;mso-wrap-distance-right:9pt;mso-wrap-distance-bottom:0;mso-position-horizontal:absolute;mso-position-horizontal-relative:text;mso-position-vertical:absolute;mso-position-vertical-relative:text;mso-width-percent:0;mso-height-percent:0;mso-width-relative:margin;mso-height-relative:margin;v-text-anchor:middle" arcsize="10923f" o:gfxdata="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" fillcolor="white [3212]" strokecolor="#09101d [484]" strokeweight="2.25pt">
+              <v:roundrect w14:anchorId="3796A4FE" id="Rectángulo: esquinas redondeadas 11" o:spid="_x0000_s1030" style="position:absolute;left:0;text-align:left;margin-left:6.25pt;margin-top:6.75pt;width:120.25pt;height:35.7pt;z-index:251670528;visibility:visible;mso-wrap-style:square;mso-width-percent:0;mso-height-percent:0;mso-wrap-distance-left:9pt;mso-wrap-distance-top:0;mso-wrap-distance-right:9pt;mso-wrap-distance-bottom:0;mso-position-horizontal:absolute;mso-position-horizontal-relative:text;mso-position-vertical:absolute;mso-position-vertical-relative:text;mso-width-percent:0;mso-height-percent:0;mso-width-relative:margin;mso-height-relative:margin;v-text-anchor:middle" arcsize="10923f" o:gfxdata="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" fillcolor="white [3212]" strokecolor="#09101d [484]" strokeweight="2.25pt">
                 <v:stroke joinstyle="miter"/>
                 <v:textbox>
                   <w:txbxContent>
@@ -1575,6 +1718,7 @@
                           </w14:textOutline>
                         </w:rPr>
                       </w:pPr>
+                      <w:proofErr w:type="spellStart"/>
                       <w:r>
                         <w:rPr>
                           <w:bCs/>
@@ -1594,7 +1738,29 @@
                             <w14:round/>
                           </w14:textOutline>
                         </w:rPr>
-                        <w:t>N° *N*</w:t>
+                        <w:t>N°</w:t>
+                      </w:r>
+                      <w:proofErr w:type="spellEnd"/>
+                      <w:r>
+                        <w:rPr>
+                          <w:bCs/>
+                          <w:color w:val="C00000"/>
+                          <w:sz w:val="44"/>
+                          <w:szCs w:val="44"/>
+                          <w14:shadow w14:blurRad="38100" w14:dist="19050" w14:dir="2700000" w14:sx="100000" w14:sy="100000" w14:kx="0" w14:ky="0" w14:algn="tl">
+                            <w14:schemeClr w14:val="dk1">
+                              <w14:alpha w14:val="60000"/>
+                            </w14:schemeClr>
+                          </w14:shadow>
+                          <w14:textOutline w14:w="3175" w14:cap="flat" w14:cmpd="sng" w14:algn="ctr">
+                            <w14:solidFill>
+                              <w14:srgbClr w14:val="C00000"/>
+                            </w14:solidFill>
+                            <w14:prstDash w14:val="solid"/>
+                            <w14:round/>
+                          </w14:textOutline>
+                        </w:rPr>
+                        <w:t xml:space="preserve"> *N*</w:t>
                       </w:r>
                     </w:p>
                     <w:p>
@@ -1718,7 +1884,7 @@
           </mc:Choice>
           <mc:Fallback>
             <w:pict>
-              <v:shape w14:anchorId="42C0FA8E" id="_x0000_s1031" type="#_x0000_t202" style="position:absolute;left:0;text-align:left;margin-left:209.7pt;margin-top:11.8pt;width:2in;height:2in;z-index:251669504;visibility:visible;mso-wrap-style:none;mso-wrap-distance-left:9pt;mso-wrap-distance-top:0;mso-wrap-distance-right:9pt;mso-wrap-distance-bottom:0;mso-position-horizontal:absolute;mso-position-horizontal-relative:text;mso-position-vertical:absolute;mso-position-vertical-relative:text;v-text-anchor:top" o:gfxdata="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" filled="f" stroked="f">
+              <v:shape w14:anchorId="42C0FA8E" id="_x0000_s1031" type="#_x0000_t202" style="position:absolute;left:0;text-align:left;margin-left:209.7pt;margin-top:11.8pt;width:2in;height:2in;z-index:251669504;visibility:visible;mso-wrap-style:none;mso-wrap-distance-left:9pt;mso-wrap-distance-top:0;mso-wrap-distance-right:9pt;mso-wrap-distance-bottom:0;mso-position-horizontal:absolute;mso-position-horizontal-relative:text;mso-position-vertical:absolute;mso-position-vertical-relative:text;v-text-anchor:top" o:gfxdata="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" filled="f" stroked="f">
                 <v:textbox style="mso-fit-shape-to-text:t">
                   <w:txbxContent>
                     <w:p>
@@ -1788,7 +1954,7 @@
         <mc:AlternateContent>
           <mc:Choice Requires="wps">
             <w:drawing>
-              <wp:anchor distT="0" distB="0" distL="114300" distR="114300" simplePos="0" relativeHeight="251672576" behindDoc="0" locked="0" layoutInCell="1" allowOverlap="1" wp14:anchorId="6D1849F1" wp14:editId="57D9A1DB">
+              <wp:anchor distT="0" distB="0" distL="114300" distR="114300" simplePos="0" relativeHeight="251672576" behindDoc="0" locked="0" layoutInCell="1" allowOverlap="1" wp14:anchorId="6D1849F1" wp14:editId="4E64F93C">
                 <wp:simplePos x="0" y="0"/>
                 <wp:positionH relativeFrom="column">
                   <wp:posOffset>-270841</wp:posOffset>
@@ -1835,6 +2001,13 @@
                               </w:rPr>
                               <w:t>Por el presente certificamos que se han realizado los servicios de saneamiento ambiental correspondientes a:</w:t>
                             </w:r>
+                            <w:r>
+                              <w:rPr>
+                                <w:b/>
+                                <w:bCs/>
+                              </w:rPr>
+                              <w:t xml:space="preserve"> </w:t>
+                            </w:r>
                           </w:p>
                         </w:txbxContent>
                       </wps:txbx>
@@ -1858,7 +2031,7 @@
           </mc:Choice>
           <mc:Fallback>
             <w:pict>
-              <v:shape w14:anchorId="6D1849F1" id="Cuadro de texto 12" o:spid="_x0000_s1032" type="#_x0000_t202" style="position:absolute;left:0;text-align:left;margin-left:-21.35pt;margin-top:7.75pt;width:519pt;height:21.75pt;z-index:251672576;visibility:visible;mso-wrap-style:square;mso-width-percent:0;mso-height-percent:0;mso-wrap-distance-left:9pt;mso-wrap-distance-top:0;mso-wrap-distance-right:9pt;mso-wrap-distance-bottom:0;mso-position-horizontal:absolute;mso-position-horizontal-relative:text;mso-position-vertical:absolute;mso-position-vertical-relative:text;mso-width-percent:0;mso-height-percent:0;mso-width-relative:margin;mso-height-relative:margin;v-text-anchor:top" o:gfxdata="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" filled="f" stroked="f" strokeweight=".5pt">
+              <v:shape w14:anchorId="6D1849F1" id="Cuadro de texto 12" o:spid="_x0000_s1032" type="#_x0000_t202" style="position:absolute;left:0;text-align:left;margin-left:-21.35pt;margin-top:7.75pt;width:519pt;height:21.75pt;z-index:251672576;visibility:visible;mso-wrap-style:square;mso-width-percent:0;mso-height-percent:0;mso-wrap-distance-left:9pt;mso-wrap-distance-top:0;mso-wrap-distance-right:9pt;mso-wrap-distance-bottom:0;mso-position-horizontal:absolute;mso-position-horizontal-relative:text;mso-position-vertical:absolute;mso-position-vertical-relative:text;mso-width-percent:0;mso-height-percent:0;mso-width-relative:margin;mso-height-relative:margin;v-text-anchor:top" o:gfxdata="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" filled="f" stroked="f" strokeweight=".5pt">
                 <v:textbox>
                   <w:txbxContent>
                     <w:p>
@@ -1875,6 +2048,13 @@
                           <w:bCs/>
                         </w:rPr>
                         <w:t>Por el presente certificamos que se han realizado los servicios de saneamiento ambiental correspondientes a:</w:t>
+                      </w:r>
+                      <w:r>
+                        <w:rPr>
+                          <w:b/>
+                          <w:bCs/>
+                        </w:rPr>
+                        <w:t xml:space="preserve"> </w:t>
                       </w:r>
                     </w:p>
                   </w:txbxContent>
@@ -1907,16 +2087,16 @@
         <mc:AlternateContent>
           <mc:Choice Requires="wps">
             <w:drawing>
-              <wp:anchor distT="0" distB="0" distL="114300" distR="114300" simplePos="0" relativeHeight="251668480" behindDoc="1" locked="0" layoutInCell="1" allowOverlap="1" wp14:anchorId="532327CC" wp14:editId="06BAA3C4">
+              <wp:anchor distT="0" distB="0" distL="114300" distR="114300" simplePos="0" relativeHeight="251668480" behindDoc="1" locked="0" layoutInCell="1" allowOverlap="1" wp14:anchorId="532327CC" wp14:editId="33332FF3">
                 <wp:simplePos x="0" y="0"/>
                 <wp:positionH relativeFrom="column">
-                  <wp:posOffset>-410570</wp:posOffset>
+                  <wp:posOffset>-412630</wp:posOffset>
                 </wp:positionH>
                 <wp:positionV relativeFrom="paragraph">
-                  <wp:posOffset>129189</wp:posOffset>
+                  <wp:posOffset>214810</wp:posOffset>
                 </wp:positionV>
-                <wp:extent cx="4728598" cy="1184910"/>
-                <wp:effectExtent l="0" t="0" r="0" b="0"/>
+                <wp:extent cx="4728598" cy="983411"/>
+                <wp:effectExtent l="0" t="0" r="0" b="7620"/>
                 <wp:wrapNone/>
                 <wp:docPr id="2074473094" name="Cuadro de texto 1"/>
                 <wp:cNvGraphicFramePr/>
@@ -1927,7 +2107,7 @@
                       <wps:spPr>
                         <a:xfrm>
                           <a:off x="0" y="0"/>
-                          <a:ext cx="4728598" cy="1184910"/>
+                          <a:ext cx="4728598" cy="983411"/>
                         </a:xfrm>
                         <a:prstGeom prst="rect">
                           <a:avLst/>
@@ -2038,7 +2218,7 @@
                                 <w:spacing w:val="-1"/>
                                 <w:sz w:val="20"/>
                               </w:rPr>
-                              <w:t>LIMPIEZA Y MANTENIMIENTO DE BUZONES Y CAJAS DE PASE</w:t>
+                              <w:t>LIMPIEZA Y MANTENIMIENTO DE LAS CONEXIONES SANITARIAS</w:t>
                             </w:r>
                           </w:p>
                           <w:p>
@@ -2051,30 +2231,6 @@
                                 <w:sz w:val="20"/>
                               </w:rPr>
                             </w:pPr>
-                          </w:p>
-                          <w:p>
-                            <w:pPr>
-                              <w:pStyle w:val="Prrafodelista"/>
-                              <w:numPr>
-                                <w:ilvl w:val="0"/>
-                                <w:numId w:val="1"/>
-                              </w:numPr>
-                              <w:rPr>
-                                <w:b/>
-                                <w:bCs/>
-                                <w:spacing w:val="-1"/>
-                                <w:sz w:val="20"/>
-                              </w:rPr>
-                            </w:pPr>
-                            <w:r>
-                              <w:rPr>
-                                <w:b/>
-                                <w:bCs/>
-                                <w:spacing w:val="-1"/>
-                                <w:sz w:val="20"/>
-                              </w:rPr>
-                              <w:t>LIMPIEZA Y MANTENIMIENTO DE REDES DE ALCANTARILLADO</w:t>
-                            </w:r>
                           </w:p>
                           <w:p>
                             <w:pPr>
@@ -2134,7 +2290,7 @@
           </mc:Choice>
           <mc:Fallback>
             <w:pict>
-              <v:shape w14:anchorId="532327CC" id="_x0000_s1033" type="#_x0000_t202" style="position:absolute;left:0;text-align:left;margin-left:-32.35pt;margin-top:10.15pt;width:372.35pt;height:93.3pt;z-index:-251648000;visibility:visible;mso-wrap-style:square;mso-width-percent:0;mso-height-percent:0;mso-wrap-distance-left:9pt;mso-wrap-distance-top:0;mso-wrap-distance-right:9pt;mso-wrap-distance-bottom:0;mso-position-horizontal:absolute;mso-position-horizontal-relative:text;mso-position-vertical:absolute;mso-position-vertical-relative:text;mso-width-percent:0;mso-height-percent:0;mso-width-relative:margin;mso-height-relative:margin;v-text-anchor:top" o:gfxdata="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" filled="f" stroked="f" strokeweight=".5pt">
+              <v:shape w14:anchorId="532327CC" id="_x0000_s1033" type="#_x0000_t202" style="position:absolute;left:0;text-align:left;margin-left:-32.5pt;margin-top:16.9pt;width:372.35pt;height:77.45pt;z-index:-251648000;visibility:visible;mso-wrap-style:square;mso-width-percent:0;mso-height-percent:0;mso-wrap-distance-left:9pt;mso-wrap-distance-top:0;mso-wrap-distance-right:9pt;mso-wrap-distance-bottom:0;mso-position-horizontal:absolute;mso-position-horizontal-relative:text;mso-position-vertical:absolute;mso-position-vertical-relative:text;mso-width-percent:0;mso-height-percent:0;mso-width-relative:margin;mso-height-relative:margin;v-text-anchor:top" o:gfxdata="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" filled="f" stroked="f" strokeweight=".5pt">
                 <v:textbox>
                   <w:txbxContent>
                     <w:p>
@@ -2236,7 +2392,7 @@
                           <w:spacing w:val="-1"/>
                           <w:sz w:val="20"/>
                         </w:rPr>
-                        <w:t>LIMPIEZA Y MANTENIMIENTO DE BUZONES Y CAJAS DE PASE</w:t>
+                        <w:t>LIMPIEZA Y MANTENIMIENTO DE LAS CONEXIONES SANITARIAS</w:t>
                       </w:r>
                     </w:p>
                     <w:p>
@@ -2249,30 +2405,6 @@
                           <w:sz w:val="20"/>
                         </w:rPr>
                       </w:pPr>
-                    </w:p>
-                    <w:p>
-                      <w:pPr>
-                        <w:pStyle w:val="Prrafodelista"/>
-                        <w:numPr>
-                          <w:ilvl w:val="0"/>
-                          <w:numId w:val="1"/>
-                        </w:numPr>
-                        <w:rPr>
-                          <w:b/>
-                          <w:bCs/>
-                          <w:spacing w:val="-1"/>
-                          <w:sz w:val="20"/>
-                        </w:rPr>
-                      </w:pPr>
-                      <w:r>
-                        <w:rPr>
-                          <w:b/>
-                          <w:bCs/>
-                          <w:spacing w:val="-1"/>
-                          <w:sz w:val="20"/>
-                        </w:rPr>
-                        <w:t>LIMPIEZA Y MANTENIMIENTO DE REDES DE ALCANTARILLADO</w:t>
-                      </w:r>
                     </w:p>
                     <w:p>
                       <w:pPr>
@@ -2320,251 +2452,6 @@
       <w:r>
         <w:rPr>
           <w:rFonts w:ascii="Calibri Light" w:hAnsi="Calibri Light" w:cs="Calibri Light"/>
-          <w:b/>
-          <w:noProof/>
-          <w:sz w:val="21"/>
-          <w:szCs w:val="21"/>
-        </w:rPr>
-        <mc:AlternateContent>
-          <mc:Choice Requires="wps">
-            <w:drawing>
-              <wp:anchor distT="0" distB="0" distL="114300" distR="114300" simplePos="0" relativeHeight="251661312" behindDoc="1" locked="0" layoutInCell="1" allowOverlap="1" wp14:anchorId="412943D6" wp14:editId="671C33F8">
-                <wp:simplePos x="0" y="0"/>
-                <wp:positionH relativeFrom="column">
-                  <wp:posOffset>4271645</wp:posOffset>
-                </wp:positionH>
-                <wp:positionV relativeFrom="paragraph">
-                  <wp:posOffset>133680</wp:posOffset>
-                </wp:positionV>
-                <wp:extent cx="4787900" cy="1110615"/>
-                <wp:effectExtent l="0" t="0" r="0" b="0"/>
-                <wp:wrapNone/>
-                <wp:docPr id="1082901420" name="Cuadro de texto 1"/>
-                <wp:cNvGraphicFramePr/>
-                <a:graphic xmlns:a="http://schemas.openxmlformats.org/drawingml/2006/main">
-                  <a:graphicData uri="http://schemas.microsoft.com/office/word/2010/wordprocessingShape">
-                    <wps:wsp>
-                      <wps:cNvSpPr txBox="1"/>
-                      <wps:spPr>
-                        <a:xfrm>
-                          <a:off x="0" y="0"/>
-                          <a:ext cx="4787900" cy="1110615"/>
-                        </a:xfrm>
-                        <a:prstGeom prst="rect">
-                          <a:avLst/>
-                        </a:prstGeom>
-                        <a:noFill/>
-                        <a:ln w="6350">
-                          <a:noFill/>
-                        </a:ln>
-                      </wps:spPr>
-                      <wps:txbx>
-                        <w:txbxContent>
-                          <w:p>
-                            <w:pPr>
-                              <w:rPr>
-                                <w:spacing w:val="-1"/>
-                                <w:sz w:val="20"/>
-                              </w:rPr>
-                            </w:pPr>
-                          </w:p>
-                          <w:p>
-                            <w:pPr>
-                              <w:pStyle w:val="Prrafodelista"/>
-                              <w:numPr>
-                                <w:ilvl w:val="0"/>
-                                <w:numId w:val="1"/>
-                              </w:numPr>
-                              <w:rPr>
-                                <w:b/>
-                                <w:bCs/>
-                                <w:spacing w:val="-1"/>
-                                <w:sz w:val="20"/>
-                              </w:rPr>
-                            </w:pPr>
-                            <w:r>
-                              <w:rPr>
-                                <w:b/>
-                                <w:bCs/>
-                                <w:spacing w:val="-1"/>
-                                <w:sz w:val="20"/>
-                              </w:rPr>
-                              <w:t>LIMPIEZA Y MANTENIMIENTO DE LAS CONEXIONES SANITARIAS</w:t>
-                            </w:r>
-                          </w:p>
-                          <w:p>
-                            <w:pPr>
-                              <w:pStyle w:val="Prrafodelista"/>
-                              <w:ind w:left="720"/>
-                              <w:rPr>
-                                <w:b/>
-                                <w:bCs/>
-                                <w:spacing w:val="-1"/>
-                                <w:sz w:val="20"/>
-                              </w:rPr>
-                            </w:pPr>
-                          </w:p>
-                          <w:p>
-                            <w:pPr>
-                              <w:pStyle w:val="Prrafodelista"/>
-                              <w:numPr>
-                                <w:ilvl w:val="0"/>
-                                <w:numId w:val="1"/>
-                              </w:numPr>
-                              <w:rPr>
-                                <w:b/>
-                                <w:bCs/>
-                                <w:spacing w:val="-1"/>
-                                <w:sz w:val="20"/>
-                              </w:rPr>
-                            </w:pPr>
-                            <w:r>
-                              <w:rPr>
-                                <w:b/>
-                                <w:bCs/>
-                                <w:spacing w:val="-1"/>
-                                <w:sz w:val="20"/>
-                              </w:rPr>
-                              <w:t>FUMIGACIÓN, DESINSECTACIÓN Y DESRATIZACIÓN</w:t>
-                            </w:r>
-                          </w:p>
-                          <w:p>
-                            <w:pPr>
-                              <w:rPr>
-                                <w:b/>
-                                <w:bCs/>
-                                <w:spacing w:val="-1"/>
-                                <w:sz w:val="20"/>
-                              </w:rPr>
-                            </w:pPr>
-                          </w:p>
-                          <w:p>
-                            <w:pPr>
-                              <w:rPr>
-                                <w:lang w:val="es-PE"/>
-                              </w:rPr>
-                            </w:pPr>
-                          </w:p>
-                        </w:txbxContent>
-                      </wps:txbx>
-                      <wps:bodyPr rot="0" spcFirstLastPara="0" vertOverflow="overflow" horzOverflow="overflow" vert="horz" wrap="square" lIns="91440" tIns="45720" rIns="91440" bIns="45720" numCol="1" spcCol="0" rtlCol="0" fromWordArt="0" anchor="t" anchorCtr="0" forceAA="0" compatLnSpc="1">
-                        <a:prstTxWarp prst="textNoShape">
-                          <a:avLst/>
-                        </a:prstTxWarp>
-                        <a:noAutofit/>
-                      </wps:bodyPr>
-                    </wps:wsp>
-                  </a:graphicData>
-                </a:graphic>
-                <wp14:sizeRelH relativeFrom="margin">
-                  <wp14:pctWidth>0</wp14:pctWidth>
-                </wp14:sizeRelH>
-                <wp14:sizeRelV relativeFrom="margin">
-                  <wp14:pctHeight>0</wp14:pctHeight>
-                </wp14:sizeRelV>
-              </wp:anchor>
-            </w:drawing>
-          </mc:Choice>
-          <mc:Fallback>
-            <w:pict>
-              <v:shape w14:anchorId="412943D6" id="_x0000_s1034" type="#_x0000_t202" style="position:absolute;left:0;text-align:left;margin-left:336.35pt;margin-top:10.55pt;width:377pt;height:87.45pt;z-index:-251655168;visibility:visible;mso-wrap-style:square;mso-width-percent:0;mso-height-percent:0;mso-wrap-distance-left:9pt;mso-wrap-distance-top:0;mso-wrap-distance-right:9pt;mso-wrap-distance-bottom:0;mso-position-horizontal:absolute;mso-position-horizontal-relative:text;mso-position-vertical:absolute;mso-position-vertical-relative:text;mso-width-percent:0;mso-height-percent:0;mso-width-relative:margin;mso-height-relative:margin;v-text-anchor:top" o:gfxdata="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" filled="f" stroked="f" strokeweight=".5pt">
-                <v:textbox>
-                  <w:txbxContent>
-                    <w:p>
-                      <w:pPr>
-                        <w:rPr>
-                          <w:spacing w:val="-1"/>
-                          <w:sz w:val="20"/>
-                        </w:rPr>
-                      </w:pPr>
-                    </w:p>
-                    <w:p>
-                      <w:pPr>
-                        <w:pStyle w:val="Prrafodelista"/>
-                        <w:numPr>
-                          <w:ilvl w:val="0"/>
-                          <w:numId w:val="1"/>
-                        </w:numPr>
-                        <w:rPr>
-                          <w:b/>
-                          <w:bCs/>
-                          <w:spacing w:val="-1"/>
-                          <w:sz w:val="20"/>
-                        </w:rPr>
-                      </w:pPr>
-                      <w:r>
-                        <w:rPr>
-                          <w:b/>
-                          <w:bCs/>
-                          <w:spacing w:val="-1"/>
-                          <w:sz w:val="20"/>
-                        </w:rPr>
-                        <w:t>LIMPIEZA Y MANTENIMIENTO DE LAS CONEXIONES SANITARIAS</w:t>
-                      </w:r>
-                    </w:p>
-                    <w:p>
-                      <w:pPr>
-                        <w:pStyle w:val="Prrafodelista"/>
-                        <w:ind w:left="720"/>
-                        <w:rPr>
-                          <w:b/>
-                          <w:bCs/>
-                          <w:spacing w:val="-1"/>
-                          <w:sz w:val="20"/>
-                        </w:rPr>
-                      </w:pPr>
-                    </w:p>
-                    <w:p>
-                      <w:pPr>
-                        <w:pStyle w:val="Prrafodelista"/>
-                        <w:numPr>
-                          <w:ilvl w:val="0"/>
-                          <w:numId w:val="1"/>
-                        </w:numPr>
-                        <w:rPr>
-                          <w:b/>
-                          <w:bCs/>
-                          <w:spacing w:val="-1"/>
-                          <w:sz w:val="20"/>
-                        </w:rPr>
-                      </w:pPr>
-                      <w:r>
-                        <w:rPr>
-                          <w:b/>
-                          <w:bCs/>
-                          <w:spacing w:val="-1"/>
-                          <w:sz w:val="20"/>
-                        </w:rPr>
-                        <w:t>FUMIGACIÓN, DESINSECTACIÓN Y DESRATIZACIÓN</w:t>
-                      </w:r>
-                    </w:p>
-                    <w:p>
-                      <w:pPr>
-                        <w:rPr>
-                          <w:b/>
-                          <w:bCs/>
-                          <w:spacing w:val="-1"/>
-                          <w:sz w:val="20"/>
-                        </w:rPr>
-                      </w:pPr>
-                    </w:p>
-                    <w:p>
-                      <w:pPr>
-                        <w:rPr>
-                          <w:lang w:val="es-PE"/>
-                        </w:rPr>
-                      </w:pPr>
-                    </w:p>
-                  </w:txbxContent>
-                </v:textbox>
-              </v:shape>
-            </w:pict>
-          </mc:Fallback>
-        </mc:AlternateContent>
-      </w:r>
-      <w:r>
-        <w:rPr>
-          <w:rFonts w:ascii="Calibri Light" w:hAnsi="Calibri Light" w:cs="Calibri Light"/>
           <w:sz w:val="21"/>
           <w:szCs w:val="21"/>
         </w:rPr>
@@ -2586,86 +2473,13 @@
           <w:noProof/>
         </w:rPr>
         <w:drawing>
-          <wp:anchor distT="0" distB="0" distL="114300" distR="114300" simplePos="0" relativeHeight="251680768" behindDoc="1" locked="0" layoutInCell="1" allowOverlap="1" wp14:anchorId="40029905" wp14:editId="3EB52C2F">
-            <wp:simplePos x="0" y="0"/>
-            <wp:positionH relativeFrom="column">
-              <wp:posOffset>4606290</wp:posOffset>
-            </wp:positionH>
-            <wp:positionV relativeFrom="paragraph">
-              <wp:posOffset>28575</wp:posOffset>
-            </wp:positionV>
-            <wp:extent cx="82550" cy="82550"/>
-            <wp:effectExtent l="0" t="0" r="0" b="0"/>
-            <wp:wrapNone/>
-            <wp:docPr id="341487284" name="Imagen 341487284" descr="Icono&#10;&#10;Descripción generada automáticamente"/>
-            <wp:cNvGraphicFramePr>
-              <a:graphicFrameLocks xmlns:a="http://schemas.openxmlformats.org/drawingml/2006/main" noChangeAspect="1"/>
-            </wp:cNvGraphicFramePr>
-            <a:graphic xmlns:a="http://schemas.openxmlformats.org/drawingml/2006/main">
-              <a:graphicData uri="http://schemas.openxmlformats.org/drawingml/2006/picture">
-                <pic:pic xmlns:pic="http://schemas.openxmlformats.org/drawingml/2006/picture">
-                  <pic:nvPicPr>
-                    <pic:cNvPr id="1366903310" name="Imagen 4" descr="Icono&#10;&#10;Descripción generada automáticamente"/>
-                    <pic:cNvPicPr/>
-                  </pic:nvPicPr>
-                  <pic:blipFill>
-                    <a:blip r:embed="rId10" cstate="print">
-                      <a:extLst>
-                        <a:ext uri="{BEBA8EAE-BF5A-486C-A8C5-ECC9F3942E4B}">
-                          <a14:imgProps xmlns:a14="http://schemas.microsoft.com/office/drawing/2010/main">
-                            <a14:imgLayer r:embed="rId11">
-                              <a14:imgEffect>
-                                <a14:sharpenSoften amount="25000"/>
-                              </a14:imgEffect>
-                              <a14:imgEffect>
-                                <a14:brightnessContrast bright="20000" contrast="20000"/>
-                              </a14:imgEffect>
-                            </a14:imgLayer>
-                          </a14:imgProps>
-                        </a:ext>
-                        <a:ext uri="{28A0092B-C50C-407E-A947-70E740481C1C}">
-                          <a14:useLocalDpi xmlns:a14="http://schemas.microsoft.com/office/drawing/2010/main" val="0"/>
-                        </a:ext>
-                      </a:extLst>
-                    </a:blip>
-                    <a:stretch>
-                      <a:fillRect/>
-                    </a:stretch>
-                  </pic:blipFill>
-                  <pic:spPr>
-                    <a:xfrm>
-                      <a:off x="0" y="0"/>
-                      <a:ext cx="82550" cy="82550"/>
-                    </a:xfrm>
-                    <a:prstGeom prst="rect">
-                      <a:avLst/>
-                    </a:prstGeom>
-                  </pic:spPr>
-                </pic:pic>
-              </a:graphicData>
-            </a:graphic>
-            <wp14:sizeRelH relativeFrom="page">
-              <wp14:pctWidth>0</wp14:pctWidth>
-            </wp14:sizeRelH>
-            <wp14:sizeRelV relativeFrom="page">
-              <wp14:pctHeight>0</wp14:pctHeight>
-            </wp14:sizeRelV>
-          </wp:anchor>
-        </w:drawing>
-      </w:r>
-      <w:r>
-        <w:rPr>
-          <w:rFonts w:ascii="Calibri Light" w:eastAsia="Arial" w:hAnsi="Calibri Light" w:cs="Calibri Light"/>
-          <w:noProof/>
-        </w:rPr>
-        <w:drawing>
-          <wp:anchor distT="0" distB="0" distL="114300" distR="114300" simplePos="0" relativeHeight="251673600" behindDoc="1" locked="0" layoutInCell="1" allowOverlap="1" wp14:anchorId="476CD8F9" wp14:editId="35CC9064">
+          <wp:anchor distT="0" distB="0" distL="114300" distR="114300" simplePos="0" relativeHeight="251673600" behindDoc="1" locked="0" layoutInCell="1" allowOverlap="1" wp14:anchorId="476CD8F9" wp14:editId="12D40D53">
             <wp:simplePos x="0" y="0"/>
             <wp:positionH relativeFrom="column">
               <wp:posOffset>-73025</wp:posOffset>
             </wp:positionH>
             <wp:positionV relativeFrom="paragraph">
-              <wp:posOffset>31115</wp:posOffset>
+              <wp:posOffset>114244</wp:posOffset>
             </wp:positionV>
             <wp:extent cx="82550" cy="82550"/>
             <wp:effectExtent l="0" t="0" r="0" b="0"/>
@@ -2746,6 +2560,80 @@
           <w:bCs/>
         </w:rPr>
       </w:pPr>
+      <w:r>
+        <w:rPr>
+          <w:noProof/>
+        </w:rPr>
+        <w:drawing>
+          <wp:anchor distT="0" distB="0" distL="114300" distR="114300" simplePos="0" relativeHeight="251681792" behindDoc="1" locked="0" layoutInCell="1" allowOverlap="1" wp14:anchorId="47F31CEF" wp14:editId="485F8091">
+            <wp:simplePos x="0" y="0"/>
+            <wp:positionH relativeFrom="column">
+              <wp:posOffset>-74295</wp:posOffset>
+            </wp:positionH>
+            <wp:positionV relativeFrom="paragraph">
+              <wp:posOffset>72446</wp:posOffset>
+            </wp:positionV>
+            <wp:extent cx="82550" cy="82550"/>
+            <wp:effectExtent l="0" t="0" r="0" b="0"/>
+            <wp:wrapNone/>
+            <wp:docPr id="712166967" name="Imagen 1" descr="Icono&#10;&#10;Descripción generada automáticamente"/>
+            <wp:cNvGraphicFramePr>
+              <a:graphicFrameLocks xmlns:a="http://schemas.openxmlformats.org/drawingml/2006/main" noChangeAspect="1"/>
+            </wp:cNvGraphicFramePr>
+            <a:graphic xmlns:a="http://schemas.openxmlformats.org/drawingml/2006/main">
+              <a:graphicData uri="http://schemas.openxmlformats.org/drawingml/2006/picture">
+                <pic:pic xmlns:pic="http://schemas.openxmlformats.org/drawingml/2006/picture">
+                  <pic:nvPicPr>
+                    <pic:cNvPr id="341487284" name="Imagen 341487284" descr="Icono&#10;&#10;Descripción generada automáticamente"/>
+                    <pic:cNvPicPr>
+                      <a:picLocks noChangeAspect="1"/>
+                    </pic:cNvPicPr>
+                  </pic:nvPicPr>
+                  <pic:blipFill>
+                    <a:blip r:embed="rId10" cstate="print">
+                      <a:extLst>
+                        <a:ext uri="{BEBA8EAE-BF5A-486C-A8C5-ECC9F3942E4B}">
+                          <a14:imgProps xmlns:a14="http://schemas.microsoft.com/office/drawing/2010/main">
+                            <a14:imgLayer r:embed="rId11">
+                              <a14:imgEffect>
+                                <a14:sharpenSoften amount="25000"/>
+                              </a14:imgEffect>
+                              <a14:imgEffect>
+                                <a14:brightnessContrast bright="20000" contrast="20000"/>
+                              </a14:imgEffect>
+                            </a14:imgLayer>
+                          </a14:imgProps>
+                        </a:ext>
+                        <a:ext uri="{28A0092B-C50C-407E-A947-70E740481C1C}">
+                          <a14:useLocalDpi xmlns:a14="http://schemas.microsoft.com/office/drawing/2010/main" val="0"/>
+                        </a:ext>
+                      </a:extLst>
+                    </a:blip>
+                    <a:stretch>
+                      <a:fillRect/>
+                    </a:stretch>
+                  </pic:blipFill>
+                  <pic:spPr>
+                    <a:xfrm>
+                      <a:off x="0" y="0"/>
+                      <a:ext cx="82550" cy="82550"/>
+                    </a:xfrm>
+                    <a:prstGeom prst="rect">
+                      <a:avLst/>
+                    </a:prstGeom>
+                  </pic:spPr>
+                </pic:pic>
+              </a:graphicData>
+            </a:graphic>
+            <wp14:sizeRelH relativeFrom="page">
+              <wp14:pctWidth>0</wp14:pctWidth>
+            </wp14:sizeRelH>
+            <wp14:sizeRelV relativeFrom="page">
+              <wp14:pctHeight>0</wp14:pctHeight>
+            </wp14:sizeRelV>
+          </wp:anchor>
+        </w:drawing>
+      </w:r>
     </w:p>
     <w:p>
       <w:pPr>
@@ -3079,7 +2967,7 @@
           </mc:Choice>
           <mc:Fallback>
             <w:pict>
-              <v:shape w14:anchorId="03CC0E32" id="_x0000_s1035" type="#_x0000_t202" style="position:absolute;left:0;text-align:left;margin-left:551pt;margin-top:1.1pt;width:143.35pt;height:63.55pt;z-index:251666432;visibility:visible;mso-wrap-style:square;mso-width-percent:0;mso-height-percent:0;mso-wrap-distance-left:9pt;mso-wrap-distance-top:0;mso-wrap-distance-right:9pt;mso-wrap-distance-bottom:0;mso-position-horizontal:absolute;mso-position-horizontal-relative:margin;mso-position-vertical:absolute;mso-position-vertical-relative:text;mso-width-percent:0;mso-height-percent:0;mso-width-relative:margin;mso-height-relative:margin;v-text-anchor:top" o:gfxdata="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" filled="f" stroked="f" strokeweight=".5pt">
+              <v:shape w14:anchorId="03CC0E32" id="_x0000_s1034" type="#_x0000_t202" style="position:absolute;left:0;text-align:left;margin-left:551pt;margin-top:1.1pt;width:143.35pt;height:63.55pt;z-index:251666432;visibility:visible;mso-wrap-style:square;mso-width-percent:0;mso-height-percent:0;mso-wrap-distance-left:9pt;mso-wrap-distance-top:0;mso-wrap-distance-right:9pt;mso-wrap-distance-bottom:0;mso-position-horizontal:absolute;mso-position-horizontal-relative:margin;mso-position-vertical:absolute;mso-position-vertical-relative:text;mso-width-percent:0;mso-height-percent:0;mso-width-relative:margin;mso-height-relative:margin;v-text-anchor:top" o:gfxdata="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" filled="f" stroked="f" strokeweight=".5pt">
                 <v:textbox>
                   <w:txbxContent>
                     <w:p>
@@ -3327,11 +3215,7 @@
           </mc:Choice>
           <mc:Fallback>
             <w:pict>
-              <v:shapetype w14:anchorId="025CE6A1" id="_x0000_t202" coordsize="21600,21600" o:spt="202" path="m,l,21600r21600,l21600,xe">
-                <v:stroke joinstyle="miter"/>
-                <v:path gradientshapeok="t" o:connecttype="rect"/>
-              </v:shapetype>
-              <v:shape id="_x0000_s1036" type="#_x0000_t202" style="position:absolute;left:0;text-align:left;margin-left:381.4pt;margin-top:1.15pt;width:162pt;height:74.15pt;z-index:251667456;visibility:visible;mso-wrap-style:square;mso-width-percent:0;mso-height-percent:0;mso-wrap-distance-left:9pt;mso-wrap-distance-top:0;mso-wrap-distance-right:9pt;mso-wrap-distance-bottom:0;mso-position-horizontal:absolute;mso-position-horizontal-relative:margin;mso-position-vertical:absolute;mso-position-vertical-relative:text;mso-width-percent:0;mso-height-percent:0;mso-width-relative:margin;mso-height-relative:margin;v-text-anchor:top" o:gfxdata="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" filled="f" stroked="f" strokeweight=".5pt">
+              <v:shape w14:anchorId="025CE6A1" id="_x0000_s1035" type="#_x0000_t202" style="position:absolute;left:0;text-align:left;margin-left:381.4pt;margin-top:1.15pt;width:162pt;height:74.15pt;z-index:251667456;visibility:visible;mso-wrap-style:square;mso-width-percent:0;mso-height-percent:0;mso-wrap-distance-left:9pt;mso-wrap-distance-top:0;mso-wrap-distance-right:9pt;mso-wrap-distance-bottom:0;mso-position-horizontal:absolute;mso-position-horizontal-relative:margin;mso-position-vertical:absolute;mso-position-vertical-relative:text;mso-width-percent:0;mso-height-percent:0;mso-width-relative:margin;mso-height-relative:margin;v-text-anchor:top" o:gfxdata="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" filled="f" stroked="f" strokeweight=".5pt">
                 <v:textbox>
                   <w:txbxContent>
                     <w:p>
@@ -3731,7 +3615,7 @@
           <w:noProof/>
         </w:rPr>
         <w:drawing>
-          <wp:anchor distT="0" distB="0" distL="114300" distR="114300" simplePos="0" relativeHeight="251675648" behindDoc="1" locked="0" layoutInCell="1" allowOverlap="1" wp14:anchorId="7A41664C" wp14:editId="16AFBFBC">
+          <wp:anchor distT="0" distB="0" distL="114300" distR="114300" simplePos="0" relativeHeight="251675648" behindDoc="1" locked="0" layoutInCell="1" allowOverlap="1" wp14:anchorId="7A41664C" wp14:editId="5AA35E24">
             <wp:simplePos x="0" y="0"/>
             <wp:positionH relativeFrom="page">
               <wp:posOffset>8837930</wp:posOffset>
@@ -3801,7 +3685,7 @@
           <w:noProof/>
         </w:rPr>
         <w:drawing>
-          <wp:anchor distT="0" distB="0" distL="114300" distR="114300" simplePos="0" relativeHeight="251679744" behindDoc="0" locked="0" layoutInCell="1" allowOverlap="1" wp14:anchorId="7335954D" wp14:editId="3F756BA7">
+          <wp:anchor distT="0" distB="0" distL="114300" distR="114300" simplePos="0" relativeHeight="251679744" behindDoc="0" locked="0" layoutInCell="1" allowOverlap="1" wp14:anchorId="7335954D" wp14:editId="43D4ED60">
             <wp:simplePos x="0" y="0"/>
             <wp:positionH relativeFrom="column">
               <wp:posOffset>6709410</wp:posOffset>
@@ -3877,7 +3761,7 @@
           <w:noProof/>
         </w:rPr>
         <w:drawing>
-          <wp:anchor distT="0" distB="0" distL="114300" distR="114300" simplePos="0" relativeHeight="251674624" behindDoc="1" locked="0" layoutInCell="1" allowOverlap="1" wp14:anchorId="45A3D9A5" wp14:editId="181D849E">
+          <wp:anchor distT="0" distB="0" distL="114300" distR="114300" simplePos="0" relativeHeight="251674624" behindDoc="1" locked="0" layoutInCell="1" allowOverlap="1" wp14:anchorId="45A3D9A5" wp14:editId="2DE4F698">
             <wp:simplePos x="0" y="0"/>
             <wp:positionH relativeFrom="column">
               <wp:posOffset>1906270</wp:posOffset>
@@ -4123,10 +4007,10 @@
 </file>
 
 <file path=word/numbering.xml><?xml version="1.0" encoding="utf-8"?>
-<w:numbering xmlns:wpc="http://schemas.microsoft.com/office/word/2010/wordprocessingCanvas" xmlns:cx="http://schemas.microsoft.com/office/drawing/2014/chartex" xmlns:cx1="http://schemas.microsoft.com/office/drawing/2015/9/8/chartex" xmlns:cx2="http://schemas.microsoft.com/office/drawing/2015/10/21/chartex" xmlns:cx3="http://schemas.microsoft.com/office/drawing/2016/5/9/chartex" xmlns:cx4="http://schemas.microsoft.com/office/drawing/2016/5/10/chartex" xmlns:cx5="http://schemas.microsoft.com/office/drawing/2016/5/11/chartex" xmlns:cx6="http://schemas.microsoft.com/office/drawing/2016/5/12/chartex" xmlns:cx7="http://schemas.microsoft.com/office/drawing/2016/5/13/chartex" xmlns:cx8="http://schemas.microsoft.com/office/drawing/2016/5/14/chartex" xmlns:mc="http://schemas.openxmlformats.org/markup-compatibility/2006" xmlns:aink="http://schemas.microsoft.com/office/drawing/2016/ink" xmlns:am3d="http://schemas.microsoft.com/office/drawing/2017/model3d" xmlns:o="urn:schemas-microsoft-com:office:office" xmlns:r="http://schemas.openxmlformats.org/officeDocument/2006/relationships" xmlns:m="http://schemas.openxmlformats.org/officeDocument/2006/math" xmlns:v="urn:schemas-microsoft-com:vml" xmlns:wp14="http://schemas.microsoft.com/office/word/2010/wordprocessingDrawing" xmlns:wp="http://schemas.openxmlformats.org/drawingml/2006/wordprocessingDrawing" xmlns:w10="urn:schemas-microsoft-com:office:word" xmlns:w="http://schemas.openxmlformats.org/wordprocessingml/2006/main" xmlns:w14="http://schemas.microsoft.com/office/word/2010/wordml" xmlns:w15="http://schemas.microsoft.com/office/word/2012/wordml" xmlns:w16cex="http://schemas.microsoft.com/office/word/2018/wordml/cex" xmlns:w16cid="http://schemas.microsoft.com/office/word/2016/wordml/cid" xmlns:w16="http://schemas.microsoft.com/office/word/2018/wordml" xmlns:w16sdtdh="http://schemas.microsoft.com/office/word/2020/wordml/sdtdatahash" xmlns:w16se="http://schemas.microsoft.com/office/word/2015/wordml/symex" xmlns:wpg="http://schemas.microsoft.com/office/word/2010/wordprocessingGroup" xmlns:wpi="http://schemas.microsoft.com/office/word/2010/wordprocessingInk" xmlns:wne="http://schemas.microsoft.com/office/word/2006/wordml" xmlns:wps="http://schemas.microsoft.com/office/word/2010/wordprocessingShape" mc:Ignorable="w14 w15 w16se w16cid w16 w16cex w16sdtdh wp14">
+<w:numbering xmlns:wpc="http://schemas.microsoft.com/office/word/2010/wordprocessingCanvas" xmlns:cx="http://schemas.microsoft.com/office/drawing/2014/chartex" xmlns:cx1="http://schemas.microsoft.com/office/drawing/2015/9/8/chartex" xmlns:cx2="http://schemas.microsoft.com/office/drawing/2015/10/21/chartex" xmlns:cx3="http://schemas.microsoft.com/office/drawing/2016/5/9/chartex" xmlns:cx4="http://schemas.microsoft.com/office/drawing/2016/5/10/chartex" xmlns:cx5="http://schemas.microsoft.com/office/drawing/2016/5/11/chartex" xmlns:cx6="http://schemas.microsoft.com/office/drawing/2016/5/12/chartex" xmlns:cx7="http://schemas.microsoft.com/office/drawing/2016/5/13/chartex" xmlns:cx8="http://schemas.microsoft.com/office/drawing/2016/5/14/chartex" xmlns:mc="http://schemas.openxmlformats.org/markup-compatibility/2006" xmlns:aink="http://schemas.microsoft.com/office/drawing/2016/ink" xmlns:am3d="http://schemas.microsoft.com/office/drawing/2017/model3d" xmlns:o="urn:schemas-microsoft-com:office:office" xmlns:oel="http://schemas.microsoft.com/office/2019/extlst" xmlns:r="http://schemas.openxmlformats.org/officeDocument/2006/relationships" xmlns:m="http://schemas.openxmlformats.org/officeDocument/2006/math" xmlns:v="urn:schemas-microsoft-com:vml" xmlns:wp14="http://schemas.microsoft.com/office/word/2010/wordprocessingDrawing" xmlns:wp="http://schemas.openxmlformats.org/drawingml/2006/wordprocessingDrawing" xmlns:w10="urn:schemas-microsoft-com:office:word" xmlns:w="http://schemas.openxmlformats.org/wordprocessingml/2006/main" xmlns:w14="http://schemas.microsoft.com/office/word/2010/wordml" xmlns:w15="http://schemas.microsoft.com/office/word/2012/wordml" xmlns:w16cex="http://schemas.microsoft.com/office/word/2018/wordml/cex" xmlns:w16cid="http://schemas.microsoft.com/office/word/2016/wordml/cid" xmlns:w16="http://schemas.microsoft.com/office/word/2018/wordml" xmlns:w16du="http://schemas.microsoft.com/office/word/2023/wordml/word16du" xmlns:w16sdtdh="http://schemas.microsoft.com/office/word/2020/wordml/sdtdatahash" xmlns:w16sdtfl="http://schemas.microsoft.com/office/word/2024/wordml/sdtformatlock" xmlns:w16se="http://schemas.microsoft.com/office/word/2015/wordml/symex" xmlns:wpg="http://schemas.microsoft.com/office/word/2010/wordprocessingGroup" xmlns:wpi="http://schemas.microsoft.com/office/word/2010/wordprocessingInk" xmlns:wne="http://schemas.microsoft.com/office/word/2006/wordml" xmlns:wps="http://schemas.microsoft.com/office/word/2010/wordprocessingShape" mc:Ignorable="w14 w15 w16se w16cid w16 w16cex w16sdtdh w16sdtfl w16du wp14">
   <w:numPicBullet w:numPicBulletId="0">
     <w:pict>
-      <v:shapetype id="_x0000_t75" coordsize="21600,21600" o:spt="75" o:preferrelative="t" path="m@4@5l@4@11@9@11@9@5xe" filled="f" stroked="f">
+      <v:shapetype w14:anchorId="64EDB7C7" id="_x0000_t75" coordsize="21600,21600" o:spt="75" o:preferrelative="t" path="m@4@5l@4@11@9@11@9@5xe" filled="f" stroked="f">
         <v:stroke joinstyle="miter"/>
         <v:formulas>
           <v:f eqn="if lineDrawn pixelLineWidth 0"/>
@@ -4145,7 +4029,7 @@
         <v:path o:extrusionok="f" gradientshapeok="t" o:connecttype="rect"/>
         <o:lock v:ext="edit" aspectratio="t"/>
       </v:shapetype>
-      <v:shape id="_x0000_i1044" type="#_x0000_t75" style="width:10.65pt;height:9.6pt;visibility:visible;mso-wrap-style:square" o:bullet="t">
+      <v:shape id="_x0000_i1025" type="#_x0000_t75" style="width:10.65pt;height:9.6pt;visibility:visible;mso-wrap-style:square" o:bullet="t">
         <v:imagedata r:id="rId1" o:title=""/>
       </v:shape>
     </w:pict>
@@ -4291,14 +4175,14 @@
       </w:rPr>
     </w:lvl>
   </w:abstractNum>
-  <w:num w:numId="1">
+  <w:num w:numId="1" w16cid:durableId="272399098">
     <w:abstractNumId w:val="0"/>
   </w:num>
 </w:numbering>
 </file>
 
 <file path=word/styles.xml><?xml version="1.0" encoding="utf-8"?>
-<w:styles xmlns:mc="http://schemas.openxmlformats.org/markup-compatibility/2006" xmlns:r="http://schemas.openxmlformats.org/officeDocument/2006/relationships" xmlns:w="http://schemas.openxmlformats.org/wordprocessingml/2006/main" xmlns:w14="http://schemas.microsoft.com/office/word/2010/wordml" xmlns:w15="http://schemas.microsoft.com/office/word/2012/wordml" xmlns:w16cex="http://schemas.microsoft.com/office/word/2018/wordml/cex" xmlns:w16cid="http://schemas.microsoft.com/office/word/2016/wordml/cid" xmlns:w16="http://schemas.microsoft.com/office/word/2018/wordml" xmlns:w16sdtdh="http://schemas.microsoft.com/office/word/2020/wordml/sdtdatahash" xmlns:w16se="http://schemas.microsoft.com/office/word/2015/wordml/symex" mc:Ignorable="w14 w15 w16se w16cid w16 w16cex w16sdtdh">
+<w:styles xmlns:mc="http://schemas.openxmlformats.org/markup-compatibility/2006" xmlns:r="http://schemas.openxmlformats.org/officeDocument/2006/relationships" xmlns:w="http://schemas.openxmlformats.org/wordprocessingml/2006/main" xmlns:w14="http://schemas.microsoft.com/office/word/2010/wordml" xmlns:w15="http://schemas.microsoft.com/office/word/2012/wordml" xmlns:w16cex="http://schemas.microsoft.com/office/word/2018/wordml/cex" xmlns:w16cid="http://schemas.microsoft.com/office/word/2016/wordml/cid" xmlns:w16="http://schemas.microsoft.com/office/word/2018/wordml" xmlns:w16du="http://schemas.microsoft.com/office/word/2023/wordml/word16du" xmlns:w16sdtdh="http://schemas.microsoft.com/office/word/2020/wordml/sdtdatahash" xmlns:w16sdtfl="http://schemas.microsoft.com/office/word/2024/wordml/sdtformatlock" xmlns:w16se="http://schemas.microsoft.com/office/word/2015/wordml/symex" mc:Ignorable="w14 w15 w16se w16cid w16 w16cex w16sdtdh w16sdtfl w16du">
   <w:docDefaults>
     <w:rPrDefault>
       <w:rPr>

</xml_diff>